<commit_message>
Feat : lien sur backend et frontend pour les profil des users et choisir images
</commit_message>
<xml_diff>
--- a/docs/03_Rapport/Rapport_PAPPRO1_Toledo.docx
+++ b/docs/03_Rapport/Rapport_PAPPRO1_Toledo.docx
@@ -5,7 +5,7 @@
     <w:sdt>
       <w:sdtPr>
         <w:rPr>
-          <w:rFonts w:ascii="Century Gothic" w:hAnsi="Century Gothic"/>
+          <w:rFonts w:ascii="Century Gothic" w:eastAsiaTheme="minorHAnsi" w:hAnsi="Century Gothic"/>
           <w:color w:val="4472C4" w:themeColor="accent1"/>
           <w:lang w:eastAsia="en-US"/>
         </w:rPr>
@@ -858,8 +858,8 @@
         </w:p>
       </w:sdtContent>
     </w:sdt>
-    <w:bookmarkStart w:id="0" w:name="_Toc155697347" w:displacedByCustomXml="prev"/>
-    <w:bookmarkStart w:id="1" w:name="_Toc155696314" w:displacedByCustomXml="prev"/>
+    <w:bookmarkStart w:id="0" w:name="_Toc155696314" w:displacedByCustomXml="prev"/>
+    <w:bookmarkStart w:id="1" w:name="_Toc155697347" w:displacedByCustomXml="prev"/>
     <w:sdt>
       <w:sdtPr>
         <w:rPr>
@@ -3761,21 +3761,8 @@
           <w:szCs w:val="14"/>
           <w:lang w:eastAsia="fr-FR"/>
         </w:rPr>
-        <w:t xml:space="preserve"> complet avec toutes ses </w:t>
-      </w:r>
-      <w:proofErr w:type="gramStart"/>
-      <w:r>
-        <w:rPr>
-          <w:rFonts w:ascii="Arial" w:hAnsi="Arial"/>
-          <w:i/>
-          <w:iCs/>
-          <w:sz w:val="24"/>
-          <w:szCs w:val="14"/>
-          <w:lang w:eastAsia="fr-FR"/>
-        </w:rPr>
-        <w:t>annexes:</w:t>
-      </w:r>
-      <w:proofErr w:type="gramEnd"/>
+        <w:t xml:space="preserve"> complet avec toutes ses annexes:</w:t>
+      </w:r>
     </w:p>
     <w:p>
       <w:pPr>
@@ -3822,7 +3809,6 @@
           <w:lang w:eastAsia="fr-FR"/>
         </w:rPr>
       </w:pPr>
-      <w:proofErr w:type="gramStart"/>
       <w:r>
         <w:rPr>
           <w:rFonts w:ascii="Arial" w:hAnsi="Arial"/>
@@ -3843,19 +3829,7 @@
           <w:szCs w:val="14"/>
           <w:lang w:eastAsia="fr-FR"/>
         </w:rPr>
-        <w:t>ultimédia:</w:t>
-      </w:r>
-      <w:proofErr w:type="gramEnd"/>
-      <w:r>
-        <w:rPr>
-          <w:rFonts w:ascii="Arial" w:hAnsi="Arial"/>
-          <w:i/>
-          <w:iCs/>
-          <w:sz w:val="24"/>
-          <w:szCs w:val="14"/>
-          <w:lang w:eastAsia="fr-FR"/>
-        </w:rPr>
-        <w:t xml:space="preserve"> carte de site, maquettes papier, story </w:t>
+        <w:t xml:space="preserve">ultimédia: carte de site, maquettes papier, story </w:t>
       </w:r>
       <w:proofErr w:type="spellStart"/>
       <w:r>
@@ -3918,31 +3892,7 @@
           <w:szCs w:val="14"/>
           <w:lang w:eastAsia="fr-FR"/>
         </w:rPr>
-        <w:t xml:space="preserve">ases de </w:t>
-      </w:r>
-      <w:proofErr w:type="gramStart"/>
-      <w:r>
-        <w:rPr>
-          <w:rFonts w:ascii="Arial" w:hAnsi="Arial"/>
-          <w:i/>
-          <w:iCs/>
-          <w:sz w:val="24"/>
-          <w:szCs w:val="14"/>
-          <w:lang w:eastAsia="fr-FR"/>
-        </w:rPr>
-        <w:t>données:</w:t>
-      </w:r>
-      <w:proofErr w:type="gramEnd"/>
-      <w:r>
-        <w:rPr>
-          <w:rFonts w:ascii="Arial" w:hAnsi="Arial"/>
-          <w:i/>
-          <w:iCs/>
-          <w:sz w:val="24"/>
-          <w:szCs w:val="14"/>
-          <w:lang w:eastAsia="fr-FR"/>
-        </w:rPr>
-        <w:t xml:space="preserve"> interfaces graphiques, modèle conceptuel.</w:t>
+        <w:t>ases de données: interfaces graphiques, modèle conceptuel.</w:t>
       </w:r>
     </w:p>
     <w:p>
@@ -3961,7 +3911,6 @@
           <w:lang w:eastAsia="fr-FR"/>
         </w:rPr>
       </w:pPr>
-      <w:proofErr w:type="gramStart"/>
       <w:r>
         <w:rPr>
           <w:rFonts w:ascii="Arial" w:hAnsi="Arial"/>
@@ -3982,19 +3931,7 @@
           <w:szCs w:val="14"/>
           <w:lang w:eastAsia="fr-FR"/>
         </w:rPr>
-        <w:t>rogrammation:</w:t>
-      </w:r>
-      <w:proofErr w:type="gramEnd"/>
-      <w:r>
-        <w:rPr>
-          <w:rFonts w:ascii="Arial" w:hAnsi="Arial"/>
-          <w:i/>
-          <w:iCs/>
-          <w:sz w:val="24"/>
-          <w:szCs w:val="14"/>
-          <w:lang w:eastAsia="fr-FR"/>
-        </w:rPr>
-        <w:t xml:space="preserve"> interfaces graphiques, maquettes, analyse fonctionnelle…</w:t>
+        <w:t>rogrammation: interfaces graphiques, maquettes, analyse fonctionnelle…</w:t>
       </w:r>
     </w:p>
     <w:p>
@@ -7039,25 +6976,7 @@
           <w:iCs/>
           <w:szCs w:val="14"/>
         </w:rPr>
-        <w:t xml:space="preserve">Décrire la stratégie globale de </w:t>
-      </w:r>
-      <w:proofErr w:type="gramStart"/>
-      <w:r>
-        <w:rPr>
-          <w:i/>
-          <w:iCs/>
-          <w:szCs w:val="14"/>
-        </w:rPr>
-        <w:t>test:</w:t>
-      </w:r>
-      <w:proofErr w:type="gramEnd"/>
-      <w:r>
-        <w:rPr>
-          <w:i/>
-          <w:iCs/>
-          <w:szCs w:val="14"/>
-        </w:rPr>
-        <w:t xml:space="preserve"> </w:t>
+        <w:t xml:space="preserve">Décrire la stratégie globale de test: </w:t>
       </w:r>
     </w:p>
     <w:p>
@@ -7088,23 +7007,13 @@
           <w:szCs w:val="14"/>
         </w:rPr>
       </w:pPr>
-      <w:proofErr w:type="gramStart"/>
       <w:r>
         <w:rPr>
           <w:i/>
           <w:iCs/>
           <w:szCs w:val="14"/>
         </w:rPr>
-        <w:t>types</w:t>
-      </w:r>
-      <w:proofErr w:type="gramEnd"/>
-      <w:r>
-        <w:rPr>
-          <w:i/>
-          <w:iCs/>
-          <w:szCs w:val="14"/>
-        </w:rPr>
-        <w:t xml:space="preserve"> de des tests et ordre dans lequel ils seront effectués.</w:t>
+        <w:t>types de des tests et ordre dans lequel ils seront effectués.</w:t>
       </w:r>
     </w:p>
     <w:p>
@@ -7124,23 +7033,13 @@
           <w:szCs w:val="14"/>
         </w:rPr>
       </w:pPr>
-      <w:proofErr w:type="gramStart"/>
       <w:r>
         <w:rPr>
           <w:i/>
           <w:iCs/>
           <w:szCs w:val="14"/>
         </w:rPr>
-        <w:t>les</w:t>
-      </w:r>
-      <w:proofErr w:type="gramEnd"/>
-      <w:r>
-        <w:rPr>
-          <w:i/>
-          <w:iCs/>
-          <w:szCs w:val="14"/>
-        </w:rPr>
-        <w:t xml:space="preserve"> moyens à mettre en œuvre.</w:t>
+        <w:t>les moyens à mettre en œuvre.</w:t>
       </w:r>
     </w:p>
     <w:p>
@@ -7160,23 +7059,13 @@
           <w:szCs w:val="14"/>
         </w:rPr>
       </w:pPr>
-      <w:proofErr w:type="gramStart"/>
       <w:r>
         <w:rPr>
           <w:i/>
           <w:iCs/>
           <w:szCs w:val="14"/>
         </w:rPr>
-        <w:t>couverture</w:t>
-      </w:r>
-      <w:proofErr w:type="gramEnd"/>
-      <w:r>
-        <w:rPr>
-          <w:i/>
-          <w:iCs/>
-          <w:szCs w:val="14"/>
-        </w:rPr>
-        <w:t xml:space="preserve"> des tests (tests exhaustifs ou non, si non, pourquoi ?).</w:t>
+        <w:t>couverture des tests (tests exhaustifs ou non, si non, pourquoi ?).</w:t>
       </w:r>
     </w:p>
     <w:p>
@@ -7196,23 +7085,13 @@
           <w:szCs w:val="14"/>
         </w:rPr>
       </w:pPr>
-      <w:proofErr w:type="gramStart"/>
       <w:r>
         <w:rPr>
           <w:i/>
           <w:iCs/>
           <w:szCs w:val="14"/>
         </w:rPr>
-        <w:t>données</w:t>
-      </w:r>
-      <w:proofErr w:type="gramEnd"/>
-      <w:r>
-        <w:rPr>
-          <w:i/>
-          <w:iCs/>
-          <w:szCs w:val="14"/>
-        </w:rPr>
-        <w:t xml:space="preserve"> de test à prévoir (données réelles ?).</w:t>
+        <w:t>données de test à prévoir (données réelles ?).</w:t>
       </w:r>
     </w:p>
     <w:p>
@@ -7232,23 +7111,13 @@
           <w:szCs w:val="14"/>
         </w:rPr>
       </w:pPr>
-      <w:proofErr w:type="gramStart"/>
       <w:r>
         <w:rPr>
           <w:i/>
           <w:iCs/>
           <w:szCs w:val="14"/>
         </w:rPr>
-        <w:t>les</w:t>
-      </w:r>
-      <w:proofErr w:type="gramEnd"/>
-      <w:r>
-        <w:rPr>
-          <w:i/>
-          <w:iCs/>
-          <w:szCs w:val="14"/>
-        </w:rPr>
-        <w:t xml:space="preserve"> testeurs extérieurs éventuels.</w:t>
+        <w:t>les testeurs extérieurs éventuels.</w:t>
       </w:r>
     </w:p>
     <w:p>
@@ -7341,23 +7210,13 @@
           <w:sz w:val="24"/>
         </w:rPr>
       </w:pPr>
-      <w:proofErr w:type="gramStart"/>
       <w:r>
         <w:rPr>
           <w:rFonts w:ascii="Arial" w:hAnsi="Arial" w:cs="Arial"/>
           <w:i/>
           <w:sz w:val="24"/>
         </w:rPr>
-        <w:t>risques</w:t>
-      </w:r>
-      <w:proofErr w:type="gramEnd"/>
-      <w:r>
-        <w:rPr>
-          <w:rFonts w:ascii="Arial" w:hAnsi="Arial" w:cs="Arial"/>
-          <w:i/>
-          <w:sz w:val="24"/>
-        </w:rPr>
-        <w:t xml:space="preserve"> techniques (complexité, manque de compétences, …).</w:t>
+        <w:t>risques techniques (complexité, manque de compétences, …).</w:t>
       </w:r>
     </w:p>
     <w:p>
@@ -7395,25 +7254,7 @@
           <w:i/>
           <w:sz w:val="24"/>
         </w:rPr>
-        <w:t xml:space="preserve">Décrire aussi quelles solutions </w:t>
-      </w:r>
-      <w:proofErr w:type="gramStart"/>
-      <w:r>
-        <w:rPr>
-          <w:rFonts w:ascii="Arial" w:hAnsi="Arial" w:cs="Arial"/>
-          <w:i/>
-          <w:sz w:val="24"/>
-        </w:rPr>
-        <w:t>ont</w:t>
-      </w:r>
-      <w:proofErr w:type="gramEnd"/>
-      <w:r>
-        <w:rPr>
-          <w:rFonts w:ascii="Arial" w:hAnsi="Arial" w:cs="Arial"/>
-          <w:i/>
-          <w:sz w:val="24"/>
-        </w:rPr>
-        <w:t xml:space="preserve"> été appliquées pour réduire les risques (priorités, formation, actions, …).</w:t>
+        <w:t>Décrire aussi quelles solutions ont été appliquées pour réduire les risques (priorités, formation, actions, …).</w:t>
       </w:r>
     </w:p>
     <w:p>
@@ -7518,7 +7359,6 @@
           <w:lang w:eastAsia="fr-FR"/>
         </w:rPr>
       </w:pPr>
-      <w:proofErr w:type="gramStart"/>
       <w:r>
         <w:rPr>
           <w:rFonts w:ascii="Arial" w:hAnsi="Arial"/>
@@ -7528,19 +7368,7 @@
           <w:szCs w:val="14"/>
           <w:lang w:eastAsia="fr-FR"/>
         </w:rPr>
-        <w:t>planning</w:t>
-      </w:r>
-      <w:proofErr w:type="gramEnd"/>
-      <w:r>
-        <w:rPr>
-          <w:rFonts w:ascii="Arial" w:hAnsi="Arial"/>
-          <w:i/>
-          <w:iCs/>
-          <w:sz w:val="24"/>
-          <w:szCs w:val="14"/>
-          <w:lang w:eastAsia="fr-FR"/>
-        </w:rPr>
-        <w:t xml:space="preserve"> indiquant les dates de début et de fin du projet ainsi que le découpage connu des diverses phases. </w:t>
+        <w:t xml:space="preserve">planning indiquant les dates de début et de fin du projet ainsi que le découpage connu des diverses phases. </w:t>
       </w:r>
     </w:p>
     <w:p>
@@ -7559,7 +7387,6 @@
           <w:lang w:eastAsia="fr-FR"/>
         </w:rPr>
       </w:pPr>
-      <w:proofErr w:type="gramStart"/>
       <w:r>
         <w:rPr>
           <w:rFonts w:ascii="Arial" w:hAnsi="Arial"/>
@@ -7569,19 +7396,7 @@
           <w:szCs w:val="14"/>
           <w:lang w:eastAsia="fr-FR"/>
         </w:rPr>
-        <w:t>partage</w:t>
-      </w:r>
-      <w:proofErr w:type="gramEnd"/>
-      <w:r>
-        <w:rPr>
-          <w:rFonts w:ascii="Arial" w:hAnsi="Arial"/>
-          <w:i/>
-          <w:iCs/>
-          <w:sz w:val="24"/>
-          <w:szCs w:val="14"/>
-          <w:lang w:eastAsia="fr-FR"/>
-        </w:rPr>
-        <w:t xml:space="preserve"> des tâches en cas de travail à plusieurs.</w:t>
+        <w:t>partage des tâches en cas de travail à plusieurs.</w:t>
       </w:r>
     </w:p>
     <w:p>
@@ -7734,18 +7549,8 @@
           <w:i/>
           <w:sz w:val="24"/>
         </w:rPr>
-        <w:t xml:space="preserve">Fournir tous les document de </w:t>
-      </w:r>
-      <w:proofErr w:type="gramStart"/>
-      <w:r>
-        <w:rPr>
-          <w:rFonts w:ascii="Arial" w:hAnsi="Arial" w:cs="Arial"/>
-          <w:i/>
-          <w:sz w:val="24"/>
-        </w:rPr>
-        <w:t>conception:</w:t>
-      </w:r>
-      <w:proofErr w:type="gramEnd"/>
+        <w:t>Fournir tous les document de conception:</w:t>
+      </w:r>
     </w:p>
     <w:p>
       <w:pPr>
@@ -7775,23 +7580,13 @@
           <w:sz w:val="24"/>
         </w:rPr>
       </w:pPr>
-      <w:proofErr w:type="gramStart"/>
       <w:r>
         <w:rPr>
           <w:rFonts w:ascii="Arial" w:hAnsi="Arial" w:cs="Arial"/>
           <w:i/>
           <w:sz w:val="24"/>
         </w:rPr>
-        <w:t>le</w:t>
-      </w:r>
-      <w:proofErr w:type="gramEnd"/>
-      <w:r>
-        <w:rPr>
-          <w:rFonts w:ascii="Arial" w:hAnsi="Arial" w:cs="Arial"/>
-          <w:i/>
-          <w:sz w:val="24"/>
-        </w:rPr>
-        <w:t xml:space="preserve"> choix du matériel HW</w:t>
+        <w:t>le choix du matériel HW</w:t>
       </w:r>
     </w:p>
     <w:p>
@@ -7807,23 +7602,13 @@
           <w:sz w:val="24"/>
         </w:rPr>
       </w:pPr>
-      <w:proofErr w:type="gramStart"/>
       <w:r>
         <w:rPr>
           <w:rFonts w:ascii="Arial" w:hAnsi="Arial" w:cs="Arial"/>
           <w:i/>
           <w:sz w:val="24"/>
         </w:rPr>
-        <w:t>le</w:t>
-      </w:r>
-      <w:proofErr w:type="gramEnd"/>
-      <w:r>
-        <w:rPr>
-          <w:rFonts w:ascii="Arial" w:hAnsi="Arial" w:cs="Arial"/>
-          <w:i/>
-          <w:sz w:val="24"/>
-        </w:rPr>
-        <w:t xml:space="preserve"> choix des systèmes d'exploitation pour la réalisation </w:t>
+        <w:t xml:space="preserve">le choix des systèmes d'exploitation pour la réalisation </w:t>
       </w:r>
       <w:r>
         <w:rPr>
@@ -7856,23 +7641,13 @@
           <w:sz w:val="24"/>
         </w:rPr>
       </w:pPr>
-      <w:proofErr w:type="gramStart"/>
       <w:r>
         <w:rPr>
           <w:rFonts w:ascii="Arial" w:hAnsi="Arial" w:cs="Arial"/>
           <w:i/>
           <w:sz w:val="24"/>
         </w:rPr>
-        <w:t>le</w:t>
-      </w:r>
-      <w:proofErr w:type="gramEnd"/>
-      <w:r>
-        <w:rPr>
-          <w:rFonts w:ascii="Arial" w:hAnsi="Arial" w:cs="Arial"/>
-          <w:i/>
-          <w:sz w:val="24"/>
-        </w:rPr>
-        <w:t xml:space="preserve"> choix des outils logiciels pour la réalisation </w:t>
+        <w:t xml:space="preserve">le choix des outils logiciels pour la réalisation </w:t>
       </w:r>
       <w:r>
         <w:rPr>
@@ -7905,23 +7680,13 @@
           <w:sz w:val="24"/>
         </w:rPr>
       </w:pPr>
-      <w:proofErr w:type="gramStart"/>
       <w:r>
         <w:rPr>
           <w:rFonts w:ascii="Arial" w:hAnsi="Arial" w:cs="Arial"/>
           <w:i/>
           <w:sz w:val="24"/>
         </w:rPr>
-        <w:t>site</w:t>
-      </w:r>
-      <w:proofErr w:type="gramEnd"/>
-      <w:r>
-        <w:rPr>
-          <w:rFonts w:ascii="Arial" w:hAnsi="Arial" w:cs="Arial"/>
-          <w:i/>
-          <w:sz w:val="24"/>
-        </w:rPr>
-        <w:t xml:space="preserve"> web: réaliser les maquettes avec un logiciel, décrire toutes les animations sur papier, définir les mots-clés, choisir une formule d'hébergement, définir la méthode de mise à jour, …</w:t>
+        <w:t>site web: réaliser les maquettes avec un logiciel, décrire toutes les animations sur papier, définir les mots-clés, choisir une formule d'hébergement, définir la méthode de mise à jour, …</w:t>
       </w:r>
     </w:p>
     <w:p>
@@ -7937,23 +7702,13 @@
           <w:sz w:val="24"/>
         </w:rPr>
       </w:pPr>
-      <w:proofErr w:type="gramStart"/>
       <w:r>
         <w:rPr>
           <w:rFonts w:ascii="Arial" w:hAnsi="Arial" w:cs="Arial"/>
           <w:i/>
           <w:sz w:val="24"/>
         </w:rPr>
-        <w:t>bases</w:t>
-      </w:r>
-      <w:proofErr w:type="gramEnd"/>
-      <w:r>
-        <w:rPr>
-          <w:rFonts w:ascii="Arial" w:hAnsi="Arial" w:cs="Arial"/>
-          <w:i/>
-          <w:sz w:val="24"/>
-        </w:rPr>
-        <w:t xml:space="preserve"> de données: décrire le modèle relationnel, le contenu détaillé des tables (caractéristiques de chaque champs) et les requêtes.</w:t>
+        <w:t>bases de données: décrire le modèle relationnel, le contenu détaillé des tables (caractéristiques de chaque champs) et les requêtes.</w:t>
       </w:r>
     </w:p>
     <w:p>
@@ -7969,23 +7724,13 @@
           <w:sz w:val="24"/>
         </w:rPr>
       </w:pPr>
-      <w:proofErr w:type="gramStart"/>
       <w:r>
         <w:rPr>
           <w:rFonts w:ascii="Arial" w:hAnsi="Arial" w:cs="Arial"/>
           <w:i/>
           <w:sz w:val="24"/>
         </w:rPr>
-        <w:t>programmation</w:t>
-      </w:r>
-      <w:proofErr w:type="gramEnd"/>
-      <w:r>
-        <w:rPr>
-          <w:rFonts w:ascii="Arial" w:hAnsi="Arial" w:cs="Arial"/>
-          <w:i/>
-          <w:sz w:val="24"/>
-        </w:rPr>
-        <w:t xml:space="preserve"> et scripts: organigramme, architecture du programme, découpage modulaire, entrées-sorties des modules, pseudo-code / </w:t>
+        <w:t xml:space="preserve">programmation et scripts: organigramme, architecture du programme, découpage modulaire, entrées-sorties des modules, pseudo-code / </w:t>
       </w:r>
       <w:proofErr w:type="spellStart"/>
       <w:r>
@@ -8173,21 +7918,12 @@
           <w:iCs/>
         </w:rPr>
       </w:pPr>
-      <w:proofErr w:type="gramStart"/>
       <w:r>
         <w:rPr>
           <w:i/>
           <w:iCs/>
         </w:rPr>
-        <w:t>les</w:t>
-      </w:r>
-      <w:proofErr w:type="gramEnd"/>
-      <w:r>
-        <w:rPr>
-          <w:i/>
-          <w:iCs/>
-        </w:rPr>
-        <w:t xml:space="preserve"> répertoires où le logiciel est installé</w:t>
+        <w:t>les répertoires où le logiciel est installé</w:t>
       </w:r>
     </w:p>
     <w:p>
@@ -8207,21 +7943,12 @@
           <w:iCs/>
         </w:rPr>
       </w:pPr>
-      <w:proofErr w:type="gramStart"/>
       <w:r>
         <w:rPr>
           <w:i/>
           <w:iCs/>
         </w:rPr>
-        <w:t>la</w:t>
-      </w:r>
-      <w:proofErr w:type="gramEnd"/>
-      <w:r>
-        <w:rPr>
-          <w:i/>
-          <w:iCs/>
-        </w:rPr>
-        <w:t xml:space="preserve"> liste de tous les fichiers et une rapide description de leur contenu (des noms qui parlent !)</w:t>
+        <w:t>la liste de tous les fichiers et une rapide description de leur contenu (des noms qui parlent !)</w:t>
       </w:r>
     </w:p>
     <w:p>
@@ -8241,21 +7968,12 @@
           <w:iCs/>
         </w:rPr>
       </w:pPr>
-      <w:proofErr w:type="gramStart"/>
       <w:r>
         <w:rPr>
           <w:i/>
           <w:iCs/>
         </w:rPr>
-        <w:t>les</w:t>
-      </w:r>
-      <w:proofErr w:type="gramEnd"/>
-      <w:r>
-        <w:rPr>
-          <w:i/>
-          <w:iCs/>
-        </w:rPr>
-        <w:t xml:space="preserve"> versions des systèmes d'exploitation et des outils logiciels</w:t>
+        <w:t>les versions des systèmes d'exploitation et des outils logiciels</w:t>
       </w:r>
     </w:p>
     <w:p>
@@ -8275,21 +7993,12 @@
           <w:iCs/>
         </w:rPr>
       </w:pPr>
-      <w:proofErr w:type="gramStart"/>
       <w:r>
         <w:rPr>
           <w:i/>
           <w:iCs/>
         </w:rPr>
-        <w:t>la</w:t>
-      </w:r>
-      <w:proofErr w:type="gramEnd"/>
-      <w:r>
-        <w:rPr>
-          <w:i/>
-          <w:iCs/>
-        </w:rPr>
-        <w:t xml:space="preserve"> description exacte du matériel</w:t>
+        <w:t>la description exacte du matériel</w:t>
       </w:r>
     </w:p>
     <w:p>
@@ -8309,21 +8018,12 @@
           <w:iCs/>
         </w:rPr>
       </w:pPr>
-      <w:proofErr w:type="gramStart"/>
       <w:r>
         <w:rPr>
           <w:i/>
           <w:iCs/>
         </w:rPr>
-        <w:t>le</w:t>
-      </w:r>
-      <w:proofErr w:type="gramEnd"/>
-      <w:r>
-        <w:rPr>
-          <w:i/>
-          <w:iCs/>
-        </w:rPr>
-        <w:t xml:space="preserve"> numéro de version de votre produit !</w:t>
+        <w:t>le numéro de version de votre produit !</w:t>
       </w:r>
     </w:p>
     <w:p>
@@ -8344,21 +8044,12 @@
           <w:u w:val="single"/>
         </w:rPr>
       </w:pPr>
-      <w:proofErr w:type="gramStart"/>
       <w:r>
         <w:rPr>
           <w:i/>
           <w:iCs/>
         </w:rPr>
-        <w:t>programmation</w:t>
-      </w:r>
-      <w:proofErr w:type="gramEnd"/>
-      <w:r>
-        <w:rPr>
-          <w:i/>
-          <w:iCs/>
-        </w:rPr>
-        <w:t xml:space="preserve"> et scripts: librairies externes, dictionnaire des données, reconstruction du logiciel - cible à partir des sources.</w:t>
+        <w:t>programmation et scripts: librairies externes, dictionnaire des données, reconstruction du logiciel - cible à partir des sources.</w:t>
       </w:r>
     </w:p>
     <w:p>
@@ -8392,25 +8083,7 @@
           <w:iCs/>
           <w:u w:val="single"/>
         </w:rPr>
-        <w:t xml:space="preserve">Evitez d’inclure les </w:t>
-      </w:r>
-      <w:proofErr w:type="gramStart"/>
-      <w:r>
-        <w:rPr>
-          <w:i/>
-          <w:iCs/>
-          <w:u w:val="single"/>
-        </w:rPr>
-        <w:t>listings</w:t>
-      </w:r>
-      <w:proofErr w:type="gramEnd"/>
-      <w:r>
-        <w:rPr>
-          <w:i/>
-          <w:iCs/>
-          <w:u w:val="single"/>
-        </w:rPr>
-        <w:t xml:space="preserve"> des sources</w:t>
+        <w:t>Evitez d’inclure les listings des sources</w:t>
       </w:r>
       <w:r>
         <w:rPr>
@@ -8473,16 +8146,8 @@
         <w:rPr>
           <w:i/>
         </w:rPr>
-        <w:t xml:space="preserve">Pour chaque partie testée de votre projet, il faut </w:t>
-      </w:r>
-      <w:proofErr w:type="gramStart"/>
-      <w:r>
-        <w:rPr>
-          <w:i/>
-        </w:rPr>
-        <w:t>décrire:</w:t>
-      </w:r>
-      <w:proofErr w:type="gramEnd"/>
+        <w:t>Pour chaque partie testée de votre projet, il faut décrire:</w:t>
+      </w:r>
     </w:p>
     <w:p>
       <w:pPr>
@@ -8505,19 +8170,11 @@
           <w:i/>
         </w:rPr>
       </w:pPr>
-      <w:proofErr w:type="gramStart"/>
-      <w:r>
-        <w:rPr>
-          <w:i/>
-        </w:rPr>
-        <w:t>les</w:t>
-      </w:r>
-      <w:proofErr w:type="gramEnd"/>
-      <w:r>
-        <w:rPr>
-          <w:i/>
-        </w:rPr>
-        <w:t xml:space="preserve"> conditions exactes de chaque test</w:t>
+      <w:r>
+        <w:rPr>
+          <w:i/>
+        </w:rPr>
+        <w:t>les conditions exactes de chaque test</w:t>
       </w:r>
     </w:p>
     <w:p>
@@ -8531,19 +8188,11 @@
           <w:i/>
         </w:rPr>
       </w:pPr>
-      <w:proofErr w:type="gramStart"/>
-      <w:r>
-        <w:rPr>
-          <w:i/>
-        </w:rPr>
-        <w:t>les</w:t>
-      </w:r>
-      <w:proofErr w:type="gramEnd"/>
-      <w:r>
-        <w:rPr>
-          <w:i/>
-        </w:rPr>
-        <w:t xml:space="preserve"> preuves de test (papier ou fichier)</w:t>
+      <w:r>
+        <w:rPr>
+          <w:i/>
+        </w:rPr>
+        <w:t>les preuves de test (papier ou fichier)</w:t>
       </w:r>
     </w:p>
     <w:p>
@@ -8557,19 +8206,11 @@
           <w:i/>
         </w:rPr>
       </w:pPr>
-      <w:proofErr w:type="gramStart"/>
-      <w:r>
-        <w:rPr>
-          <w:i/>
-        </w:rPr>
-        <w:t>tests</w:t>
-      </w:r>
-      <w:proofErr w:type="gramEnd"/>
-      <w:r>
-        <w:rPr>
-          <w:i/>
-        </w:rPr>
-        <w:t xml:space="preserve"> sans preuve: fournir au moins une description </w:t>
+      <w:r>
+        <w:rPr>
+          <w:i/>
+        </w:rPr>
+        <w:t xml:space="preserve">tests sans preuve: fournir au moins une description </w:t>
       </w:r>
     </w:p>
     <w:p>
@@ -8631,21 +8272,7 @@
         <w:rPr>
           <w:i/>
         </w:rPr>
-        <w:t xml:space="preserve">S'il reste encore des </w:t>
-      </w:r>
-      <w:proofErr w:type="gramStart"/>
-      <w:r>
-        <w:rPr>
-          <w:i/>
-        </w:rPr>
-        <w:t>erreurs:</w:t>
-      </w:r>
-      <w:proofErr w:type="gramEnd"/>
-      <w:r>
-        <w:rPr>
-          <w:i/>
-        </w:rPr>
-        <w:t xml:space="preserve"> </w:t>
+        <w:t xml:space="preserve">S'il reste encore des erreurs: </w:t>
       </w:r>
     </w:p>
     <w:p>
@@ -8791,21 +8418,12 @@
           <w:i/>
         </w:rPr>
       </w:pPr>
-      <w:proofErr w:type="gramStart"/>
       <w:r>
         <w:rPr>
           <w:rFonts w:cs="Arial"/>
           <w:i/>
         </w:rPr>
-        <w:t>le</w:t>
-      </w:r>
-      <w:proofErr w:type="gramEnd"/>
-      <w:r>
-        <w:rPr>
-          <w:rFonts w:cs="Arial"/>
-          <w:i/>
-        </w:rPr>
-        <w:t xml:space="preserve"> rapport de projet</w:t>
+        <w:t>le rapport de projet</w:t>
       </w:r>
     </w:p>
     <w:p>
@@ -8820,21 +8438,12 @@
           <w:i/>
         </w:rPr>
       </w:pPr>
-      <w:proofErr w:type="gramStart"/>
       <w:r>
         <w:rPr>
           <w:rFonts w:cs="Arial"/>
           <w:i/>
         </w:rPr>
-        <w:t>le</w:t>
-      </w:r>
-      <w:proofErr w:type="gramEnd"/>
-      <w:r>
-        <w:rPr>
-          <w:rFonts w:cs="Arial"/>
-          <w:i/>
-        </w:rPr>
-        <w:t xml:space="preserve"> manuel d'Installation (en annexe)</w:t>
+        <w:t>le manuel d'Installation (en annexe)</w:t>
       </w:r>
     </w:p>
     <w:p>
@@ -8849,22 +8458,13 @@
           <w:i/>
         </w:rPr>
       </w:pPr>
-      <w:proofErr w:type="gramStart"/>
       <w:r>
         <w:rPr>
           <w:rFonts w:cs="Arial"/>
           <w:i/>
         </w:rPr>
         <w:lastRenderedPageBreak/>
-        <w:t>le</w:t>
-      </w:r>
-      <w:proofErr w:type="gramEnd"/>
-      <w:r>
-        <w:rPr>
-          <w:rFonts w:cs="Arial"/>
-          <w:i/>
-        </w:rPr>
-        <w:t xml:space="preserve"> manuel d'Utilisation avec des exemples graphiques (en annexe)</w:t>
+        <w:t>le manuel d'Utilisation avec des exemples graphiques (en annexe)</w:t>
       </w:r>
     </w:p>
     <w:p>
@@ -8879,21 +8479,12 @@
           <w:i/>
         </w:rPr>
       </w:pPr>
-      <w:proofErr w:type="gramStart"/>
       <w:r>
         <w:rPr>
           <w:rFonts w:cs="Arial"/>
           <w:i/>
         </w:rPr>
-        <w:t>autres</w:t>
-      </w:r>
-      <w:proofErr w:type="gramEnd"/>
-      <w:r>
-        <w:rPr>
-          <w:rFonts w:cs="Arial"/>
-          <w:i/>
-        </w:rPr>
-        <w:t>…</w:t>
+        <w:t>autres…</w:t>
       </w:r>
     </w:p>
     <w:p>
@@ -8966,15 +8557,7 @@
           <w:i/>
           <w:sz w:val="24"/>
         </w:rPr>
-        <w:t xml:space="preserve">Développez en tous cas les points </w:t>
-      </w:r>
-      <w:r>
-        <w:rPr>
-          <w:rFonts w:ascii="Arial" w:hAnsi="Arial" w:cs="Arial"/>
-          <w:i/>
-          <w:sz w:val="24"/>
-        </w:rPr>
-        <w:t>suivants :</w:t>
+        <w:t>Développez en tous cas les points suivants :</w:t>
       </w:r>
     </w:p>
     <w:p>
@@ -9213,21 +8796,7 @@
         <w:rPr>
           <w:i/>
         </w:rPr>
-        <w:t xml:space="preserve"> (Titre, auteur, date), des sites Internet (URL) consultés, des articles (Revue, date, titre, </w:t>
-      </w:r>
-      <w:proofErr w:type="gramStart"/>
-      <w:r>
-        <w:rPr>
-          <w:i/>
-        </w:rPr>
-        <w:t>auteur)…</w:t>
-      </w:r>
-      <w:proofErr w:type="gramEnd"/>
-      <w:r>
-        <w:rPr>
-          <w:i/>
-        </w:rPr>
-        <w:t xml:space="preserve"> Et de toutes les aides externes (noms)   </w:t>
+        <w:t xml:space="preserve"> (Titre, auteur, date), des sites Internet (URL) consultés, des articles (Revue, date, titre, auteur)… Et de toutes les aides externes (noms)   </w:t>
       </w:r>
     </w:p>
     <w:p>
@@ -9496,8 +9065,8 @@
       </w:pPr>
       <w:bookmarkStart w:id="72" w:name="_Toc71703270"/>
       <w:bookmarkStart w:id="73" w:name="_Toc499021854"/>
-      <w:bookmarkStart w:id="74" w:name="_Toc25553334"/>
-      <w:bookmarkStart w:id="75" w:name="_Toc221526554"/>
+      <w:bookmarkStart w:id="74" w:name="_Toc221526554"/>
+      <w:bookmarkStart w:id="75" w:name="_Toc25553334"/>
       <w:r>
         <w:rPr>
           <w:iCs/>
@@ -9506,14 +9075,14 @@
       </w:r>
       <w:bookmarkEnd w:id="72"/>
       <w:bookmarkEnd w:id="73"/>
+      <w:bookmarkEnd w:id="74"/>
+      <w:r>
+        <w:rPr>
+          <w:iCs/>
+        </w:rPr>
+        <w:t xml:space="preserve"> </w:t>
+      </w:r>
       <w:bookmarkEnd w:id="75"/>
-      <w:r>
-        <w:rPr>
-          <w:iCs/>
-        </w:rPr>
-        <w:t xml:space="preserve"> </w:t>
-      </w:r>
-      <w:bookmarkEnd w:id="74"/>
     </w:p>
     <w:p/>
     <w:p>
@@ -9543,6 +9112,393 @@
           <w:lang w:eastAsia="fr-CH"/>
         </w:rPr>
       </w:pPr>
+      <w:r>
+        <w:rPr>
+          <w:lang w:eastAsia="fr-CH"/>
+        </w:rPr>
+        <w:t>TPI - 05/03/2026</w:t>
+      </w:r>
+    </w:p>
+    <w:p>
+      <w:pPr>
+        <w:rPr>
+          <w:lang w:eastAsia="fr-CH"/>
+        </w:rPr>
+      </w:pPr>
+      <w:r>
+        <w:rPr>
+          <w:lang w:eastAsia="fr-CH"/>
+        </w:rPr>
+        <w:t>- Analyse critique, liste les contraintes et les besoins.</w:t>
+      </w:r>
+    </w:p>
+    <w:p>
+      <w:pPr>
+        <w:rPr>
+          <w:lang w:eastAsia="fr-CH"/>
+        </w:rPr>
+      </w:pPr>
+      <w:r>
+        <w:rPr>
+          <w:lang w:eastAsia="fr-CH"/>
+        </w:rPr>
+        <w:t xml:space="preserve">- Choix de la méthode Agile / </w:t>
+      </w:r>
+      <w:proofErr w:type="spellStart"/>
+      <w:r>
+        <w:rPr>
+          <w:lang w:eastAsia="fr-CH"/>
+        </w:rPr>
+        <w:t>Waterfall</w:t>
+      </w:r>
+      <w:proofErr w:type="spellEnd"/>
+    </w:p>
+    <w:p>
+      <w:pPr>
+        <w:rPr>
+          <w:lang w:eastAsia="fr-CH"/>
+        </w:rPr>
+      </w:pPr>
+      <w:r>
+        <w:rPr>
+          <w:lang w:eastAsia="fr-CH"/>
+        </w:rPr>
+        <w:t xml:space="preserve">- Planification initiale : explication du </w:t>
+      </w:r>
+      <w:proofErr w:type="spellStart"/>
+      <w:r>
+        <w:rPr>
+          <w:lang w:eastAsia="fr-CH"/>
+        </w:rPr>
+        <w:t>porcentage</w:t>
+      </w:r>
+      <w:proofErr w:type="spellEnd"/>
+      <w:r>
+        <w:rPr>
+          <w:lang w:eastAsia="fr-CH"/>
+        </w:rPr>
+        <w:t xml:space="preserve"> et stats</w:t>
+      </w:r>
+    </w:p>
+    <w:p>
+      <w:pPr>
+        <w:rPr>
+          <w:lang w:eastAsia="fr-CH"/>
+        </w:rPr>
+      </w:pPr>
+      <w:r>
+        <w:rPr>
+          <w:lang w:eastAsia="fr-CH"/>
+        </w:rPr>
+        <w:t xml:space="preserve">- Modélisation </w:t>
+      </w:r>
+      <w:proofErr w:type="spellStart"/>
+      <w:r>
+        <w:rPr>
+          <w:lang w:eastAsia="fr-CH"/>
+        </w:rPr>
+        <w:t>coneptuelle</w:t>
+      </w:r>
+      <w:proofErr w:type="spellEnd"/>
+      <w:r>
+        <w:rPr>
+          <w:lang w:eastAsia="fr-CH"/>
+        </w:rPr>
+        <w:t xml:space="preserve"> : Client-API-DB, MCD/MLD, planification, Arborescence et structures de codes</w:t>
+      </w:r>
+    </w:p>
+    <w:p>
+      <w:pPr>
+        <w:rPr>
+          <w:lang w:eastAsia="fr-CH"/>
+        </w:rPr>
+      </w:pPr>
+      <w:r>
+        <w:rPr>
+          <w:lang w:eastAsia="fr-CH"/>
+        </w:rPr>
+        <w:t xml:space="preserve">- Planification : </w:t>
+      </w:r>
+      <w:proofErr w:type="spellStart"/>
+      <w:r>
+        <w:rPr>
+          <w:lang w:eastAsia="fr-CH"/>
+        </w:rPr>
+        <w:t>anoter</w:t>
+      </w:r>
+      <w:proofErr w:type="spellEnd"/>
+      <w:r>
+        <w:rPr>
+          <w:lang w:eastAsia="fr-CH"/>
+        </w:rPr>
+        <w:t xml:space="preserve"> les meetings et les questions posées.</w:t>
+      </w:r>
+    </w:p>
+    <w:p>
+      <w:pPr>
+        <w:rPr>
+          <w:lang w:eastAsia="fr-CH"/>
+        </w:rPr>
+      </w:pPr>
+      <w:r>
+        <w:rPr>
+          <w:lang w:eastAsia="fr-CH"/>
+        </w:rPr>
+        <w:t xml:space="preserve">-Choix des outils : structure des outils, </w:t>
+      </w:r>
+      <w:proofErr w:type="spellStart"/>
+      <w:r>
+        <w:rPr>
+          <w:lang w:eastAsia="fr-CH"/>
+        </w:rPr>
+        <w:t>pourqoui</w:t>
+      </w:r>
+      <w:proofErr w:type="spellEnd"/>
+      <w:r>
+        <w:rPr>
+          <w:lang w:eastAsia="fr-CH"/>
+        </w:rPr>
+        <w:t xml:space="preserve"> MySQL</w:t>
+      </w:r>
+    </w:p>
+    <w:p>
+      <w:pPr>
+        <w:rPr>
+          <w:lang w:eastAsia="fr-CH"/>
+        </w:rPr>
+      </w:pPr>
+      <w:r>
+        <w:rPr>
+          <w:lang w:eastAsia="fr-CH"/>
+        </w:rPr>
+        <w:t xml:space="preserve">- Lexique </w:t>
+      </w:r>
+      <w:proofErr w:type="spellStart"/>
+      <w:r>
+        <w:rPr>
+          <w:lang w:eastAsia="fr-CH"/>
+        </w:rPr>
+        <w:t>préecis</w:t>
+      </w:r>
+      <w:proofErr w:type="spellEnd"/>
+      <w:r>
+        <w:rPr>
+          <w:lang w:eastAsia="fr-CH"/>
+        </w:rPr>
+        <w:t xml:space="preserve"> et </w:t>
+      </w:r>
+      <w:proofErr w:type="spellStart"/>
+      <w:r>
+        <w:rPr>
+          <w:lang w:eastAsia="fr-CH"/>
+        </w:rPr>
+        <w:t>nottations</w:t>
+      </w:r>
+      <w:proofErr w:type="spellEnd"/>
+      <w:r>
+        <w:rPr>
+          <w:lang w:eastAsia="fr-CH"/>
+        </w:rPr>
+        <w:t xml:space="preserve"> de l'ETML</w:t>
+      </w:r>
+    </w:p>
+    <w:p>
+      <w:pPr>
+        <w:rPr>
+          <w:lang w:eastAsia="fr-CH"/>
+        </w:rPr>
+      </w:pPr>
+      <w:r>
+        <w:rPr>
+          <w:lang w:eastAsia="fr-CH"/>
+        </w:rPr>
+        <w:t xml:space="preserve">- Justifications des JRNTRVL plus longs attendus. </w:t>
+      </w:r>
+    </w:p>
+    <w:p>
+      <w:pPr>
+        <w:rPr>
+          <w:lang w:eastAsia="fr-CH"/>
+        </w:rPr>
+      </w:pPr>
+      <w:r>
+        <w:rPr>
+          <w:lang w:eastAsia="fr-CH"/>
+        </w:rPr>
+        <w:t xml:space="preserve">- Gestion des risques et des </w:t>
+      </w:r>
+      <w:proofErr w:type="spellStart"/>
+      <w:r>
+        <w:rPr>
+          <w:lang w:eastAsia="fr-CH"/>
+        </w:rPr>
+        <w:t>ameliorations</w:t>
+      </w:r>
+      <w:proofErr w:type="spellEnd"/>
+    </w:p>
+    <w:p>
+      <w:pPr>
+        <w:rPr>
+          <w:lang w:eastAsia="fr-CH"/>
+        </w:rPr>
+      </w:pPr>
+      <w:r>
+        <w:rPr>
+          <w:lang w:eastAsia="fr-CH"/>
+        </w:rPr>
+        <w:lastRenderedPageBreak/>
+        <w:t xml:space="preserve">- Plan de test du </w:t>
+      </w:r>
+      <w:proofErr w:type="spellStart"/>
+      <w:r>
+        <w:rPr>
+          <w:lang w:eastAsia="fr-CH"/>
+        </w:rPr>
+        <w:t>debut</w:t>
+      </w:r>
+      <w:proofErr w:type="spellEnd"/>
+      <w:r>
+        <w:rPr>
+          <w:lang w:eastAsia="fr-CH"/>
+        </w:rPr>
+        <w:t>, pendent le projet et à la fin</w:t>
+      </w:r>
+    </w:p>
+    <w:p>
+      <w:pPr>
+        <w:rPr>
+          <w:lang w:eastAsia="fr-CH"/>
+        </w:rPr>
+      </w:pPr>
+      <w:r>
+        <w:rPr>
+          <w:lang w:eastAsia="fr-CH"/>
+        </w:rPr>
+        <w:t xml:space="preserve">-GIT </w:t>
+      </w:r>
+      <w:proofErr w:type="spellStart"/>
+      <w:r>
+        <w:rPr>
+          <w:lang w:eastAsia="fr-CH"/>
+        </w:rPr>
+        <w:t>planificatio</w:t>
+      </w:r>
+      <w:proofErr w:type="spellEnd"/>
+    </w:p>
+    <w:p>
+      <w:pPr>
+        <w:rPr>
+          <w:lang w:eastAsia="fr-CH"/>
+        </w:rPr>
+      </w:pPr>
+      <w:r>
+        <w:rPr>
+          <w:lang w:eastAsia="fr-CH"/>
+        </w:rPr>
+        <w:t>- Résumé (Doc-6) : 1 page A4 maximum, sans images, 3-4 chapitres, finit par une recommandation.</w:t>
+      </w:r>
+    </w:p>
+    <w:p>
+      <w:pPr>
+        <w:rPr>
+          <w:lang w:eastAsia="fr-CH"/>
+        </w:rPr>
+      </w:pPr>
+      <w:r>
+        <w:rPr>
+          <w:lang w:eastAsia="fr-CH"/>
+        </w:rPr>
+        <w:t xml:space="preserve">- </w:t>
+      </w:r>
+      <w:proofErr w:type="spellStart"/>
+      <w:r>
+        <w:rPr>
+          <w:lang w:eastAsia="fr-CH"/>
+        </w:rPr>
+        <w:t>Crear</w:t>
+      </w:r>
+      <w:proofErr w:type="spellEnd"/>
+      <w:r>
+        <w:rPr>
+          <w:lang w:eastAsia="fr-CH"/>
+        </w:rPr>
+        <w:t xml:space="preserve"> lista de </w:t>
+      </w:r>
+      <w:proofErr w:type="spellStart"/>
+      <w:r>
+        <w:rPr>
+          <w:lang w:eastAsia="fr-CH"/>
+        </w:rPr>
+        <w:t>legende</w:t>
+      </w:r>
+      <w:proofErr w:type="spellEnd"/>
+      <w:r>
+        <w:rPr>
+          <w:lang w:eastAsia="fr-CH"/>
+        </w:rPr>
+        <w:t xml:space="preserve"> de photos</w:t>
+      </w:r>
+    </w:p>
+    <w:p>
+      <w:pPr>
+        <w:rPr>
+          <w:lang w:eastAsia="fr-CH"/>
+        </w:rPr>
+      </w:pPr>
+      <w:r>
+        <w:rPr>
+          <w:lang w:eastAsia="fr-CH"/>
+        </w:rPr>
+        <w:t>- Diagramme de clase et code</w:t>
+      </w:r>
+    </w:p>
+    <w:p>
+      <w:pPr>
+        <w:rPr>
+          <w:lang w:eastAsia="fr-CH"/>
+        </w:rPr>
+      </w:pPr>
+      <w:r>
+        <w:rPr>
+          <w:lang w:eastAsia="fr-CH"/>
+        </w:rPr>
+        <w:t xml:space="preserve">- Glossaire. sources. </w:t>
+      </w:r>
+    </w:p>
+    <w:p>
+      <w:pPr>
+        <w:rPr>
+          <w:lang w:eastAsia="fr-CH"/>
+        </w:rPr>
+      </w:pPr>
+      <w:r>
+        <w:rPr>
+          <w:lang w:eastAsia="fr-CH"/>
+        </w:rPr>
+        <w:t xml:space="preserve">JRNDTRVL : tache, </w:t>
+      </w:r>
+      <w:proofErr w:type="spellStart"/>
+      <w:r>
+        <w:rPr>
+          <w:lang w:eastAsia="fr-CH"/>
+        </w:rPr>
+        <w:t>echecs</w:t>
+      </w:r>
+      <w:proofErr w:type="spellEnd"/>
+      <w:r>
+        <w:rPr>
+          <w:lang w:eastAsia="fr-CH"/>
+        </w:rPr>
+        <w:t xml:space="preserve">, analyse critique et solution / </w:t>
+      </w:r>
+      <w:proofErr w:type="spellStart"/>
+      <w:r>
+        <w:rPr>
+          <w:lang w:eastAsia="fr-CH"/>
+        </w:rPr>
+        <w:t>resultat</w:t>
+      </w:r>
+      <w:proofErr w:type="spellEnd"/>
     </w:p>
     <w:sectPr>
       <w:headerReference w:type="default" r:id="rId43"/>
@@ -9652,7 +9608,7 @@
             </wp:anchor>
           </w:drawing>
         </mc:Choice>
-        <mc:Fallback xmlns:a="http://schemas.openxmlformats.org/drawingml/2006/main" xmlns:w16du="http://schemas.microsoft.com/office/word/2023/wordml/word16du">
+        <mc:Fallback xmlns:w16du="http://schemas.microsoft.com/office/word/2023/wordml/word16du" xmlns:a="http://schemas.openxmlformats.org/drawingml/2006/main">
           <w:pict w14:anchorId="2AC6186A">
             <v:line id="Conector recto 2" style="position:absolute;z-index:251659264;visibility:visible;mso-wrap-style:square;mso-width-percent:0;mso-wrap-distance-left:9pt;mso-wrap-distance-top:0;mso-wrap-distance-right:9pt;mso-wrap-distance-bottom:0;mso-position-horizontal:left;mso-position-horizontal-relative:margin;mso-position-vertical:absolute;mso-position-vertical-relative:text;mso-width-percent:0;mso-width-relative:margin" o:spid="_x0000_s1026" strokecolor="#4472c4 [3204]" strokeweight=".5pt" from="0,20.1pt" to="452.9pt,20.1pt" w14:anchorId="378E8825" o:gfxdata="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">
               <v:stroke joinstyle="miter"/>
@@ -13400,6 +13356,7 @@
   <w:style w:type="character" w:default="1" w:styleId="Policepardfaut">
     <w:name w:val="Default Paragraph Font"/>
     <w:uiPriority w:val="1"/>
+    <w:semiHidden/>
     <w:unhideWhenUsed/>
   </w:style>
   <w:style w:type="table" w:default="1" w:styleId="TableauNormal">
@@ -16399,6 +16356,7 @@
     <w:rsid w:val="001F7E59"/>
     <w:rsid w:val="00246810"/>
     <w:rsid w:val="0026751F"/>
+    <w:rsid w:val="00282C9B"/>
     <w:rsid w:val="002B7213"/>
     <w:rsid w:val="002F551B"/>
     <w:rsid w:val="00315789"/>
@@ -16408,6 +16366,7 @@
     <w:rsid w:val="005D0FBE"/>
     <w:rsid w:val="006108C4"/>
     <w:rsid w:val="006C65B6"/>
+    <w:rsid w:val="006C65DA"/>
     <w:rsid w:val="007F5410"/>
     <w:rsid w:val="00926C6E"/>
     <w:rsid w:val="00956963"/>
@@ -17410,6 +17369,19 @@
 </file>
 
 <file path=customXml/item3.xml><?xml version="1.0" encoding="utf-8"?>
+<?mso-contentType ?>
+<FormTemplates xmlns="http://schemas.microsoft.com/sharepoint/v3/contenttype/forms">
+  <Display>DocumentLibraryForm</Display>
+  <Edit>DocumentLibraryForm</Edit>
+  <New>DocumentLibraryForm</New>
+</FormTemplates>
+</file>
+
+<file path=customXml/item4.xml><?xml version="1.0" encoding="utf-8"?>
+<b:Sources xmlns:b="http://schemas.openxmlformats.org/officeDocument/2006/bibliography" xmlns="http://schemas.openxmlformats.org/officeDocument/2006/bibliography" SelectedStyle="\APASixthEditionOfficeOnline.xsl" StyleName="APA" Version="6"/>
+</file>
+
+<file path=customXml/item5.xml><?xml version="1.0" encoding="utf-8"?>
 <p:properties xmlns:p="http://schemas.microsoft.com/office/2006/metadata/properties" xmlns:xsi="http://www.w3.org/2001/XMLSchema-instance" xmlns:pc="http://schemas.microsoft.com/office/infopath/2007/PartnerControls">
   <documentManagement>
     <TaxCatchAll xmlns="dfa80de1-e9bb-4cf2-893d-d06220b3971a" xsi:nil="true"/>
@@ -17418,19 +17390,6 @@
     </lcf76f155ced4ddcb4097134ff3c332f>
   </documentManagement>
 </p:properties>
-</file>
-
-<file path=customXml/item4.xml><?xml version="1.0" encoding="utf-8"?>
-<b:Sources xmlns:b="http://schemas.openxmlformats.org/officeDocument/2006/bibliography" xmlns="http://schemas.openxmlformats.org/officeDocument/2006/bibliography" SelectedStyle="\APASixthEditionOfficeOnline.xsl" StyleName="APA" Version="6"/>
-</file>
-
-<file path=customXml/item5.xml><?xml version="1.0" encoding="utf-8"?>
-<?mso-contentType ?>
-<FormTemplates xmlns="http://schemas.microsoft.com/sharepoint/v3/contenttype/forms">
-  <Display>DocumentLibraryForm</Display>
-  <Edit>DocumentLibraryForm</Edit>
-  <New>DocumentLibraryForm</New>
-</FormTemplates>
 </file>
 
 <file path=customXml/itemProps1.xml><?xml version="1.0" encoding="utf-8"?>
@@ -17461,12 +17420,9 @@
 </file>
 
 <file path=customXml/itemProps3.xml><?xml version="1.0" encoding="utf-8"?>
-<ds:datastoreItem xmlns:ds="http://schemas.openxmlformats.org/officeDocument/2006/customXml" ds:itemID="{C94D97F5-7F04-4398-BD4F-61F68830E426}">
+<ds:datastoreItem xmlns:ds="http://schemas.openxmlformats.org/officeDocument/2006/customXml" ds:itemID="{49F5DEE4-C8F3-42DE-BB91-D4B66B0C8CBB}">
   <ds:schemaRefs>
-    <ds:schemaRef ds:uri="http://schemas.microsoft.com/office/2006/metadata/properties"/>
-    <ds:schemaRef ds:uri="http://schemas.microsoft.com/office/infopath/2007/PartnerControls"/>
-    <ds:schemaRef ds:uri="dfa80de1-e9bb-4cf2-893d-d06220b3971a"/>
-    <ds:schemaRef ds:uri="98d92101-24da-4498-9971-a24673344bd8"/>
+    <ds:schemaRef ds:uri="http://schemas.microsoft.com/sharepoint/v3/contenttype/forms"/>
   </ds:schemaRefs>
 </ds:datastoreItem>
 </file>
@@ -17480,9 +17436,12 @@
 </file>
 
 <file path=customXml/itemProps5.xml><?xml version="1.0" encoding="utf-8"?>
-<ds:datastoreItem xmlns:ds="http://schemas.openxmlformats.org/officeDocument/2006/customXml" ds:itemID="{49F5DEE4-C8F3-42DE-BB91-D4B66B0C8CBB}">
+<ds:datastoreItem xmlns:ds="http://schemas.openxmlformats.org/officeDocument/2006/customXml" ds:itemID="{C94D97F5-7F04-4398-BD4F-61F68830E426}">
   <ds:schemaRefs>
-    <ds:schemaRef ds:uri="http://schemas.microsoft.com/sharepoint/v3/contenttype/forms"/>
+    <ds:schemaRef ds:uri="http://schemas.microsoft.com/office/2006/metadata/properties"/>
+    <ds:schemaRef ds:uri="http://schemas.microsoft.com/office/infopath/2007/PartnerControls"/>
+    <ds:schemaRef ds:uri="dfa80de1-e9bb-4cf2-893d-d06220b3971a"/>
+    <ds:schemaRef ds:uri="98d92101-24da-4498-9971-a24673344bd8"/>
   </ds:schemaRefs>
 </ds:datastoreItem>
 </file>
</xml_diff>

<commit_message>
Update : JNLTRV update
</commit_message>
<xml_diff>
--- a/docs/03_Rapport/Rapport_PAPPRO1_Toledo.docx
+++ b/docs/03_Rapport/Rapport_PAPPRO1_Toledo.docx
@@ -784,8 +784,8 @@
         </w:p>
       </w:sdtContent>
     </w:sdt>
-    <w:bookmarkStart w:id="1" w:name="_Toc155697347" w:displacedByCustomXml="prev"/>
-    <w:bookmarkStart w:id="2" w:name="_Toc155696314" w:displacedByCustomXml="prev"/>
+    <w:bookmarkStart w:id="1" w:name="_Toc155696314" w:displacedByCustomXml="prev"/>
+    <w:bookmarkStart w:id="2" w:name="_Toc155697347" w:displacedByCustomXml="prev"/>
     <w:sdt>
       <w:sdtPr>
         <w:rPr>
@@ -5114,7 +5114,7 @@
         </w:rPr>
         <w:lastRenderedPageBreak/>
         <w:drawing>
-          <wp:anchor distT="0" distB="0" distL="114300" distR="114300" simplePos="0" relativeHeight="251662343" behindDoc="0" locked="0" layoutInCell="1" allowOverlap="1" wp14:anchorId="1E648DC0" wp14:editId="662858FA">
+          <wp:anchor distT="0" distB="0" distL="114300" distR="114300" simplePos="0" relativeHeight="251662343" behindDoc="0" locked="0" layoutInCell="1" allowOverlap="1" wp14:anchorId="1E648DC0" wp14:editId="6219D138">
             <wp:simplePos x="0" y="0"/>
             <wp:positionH relativeFrom="column">
               <wp:posOffset>653726</wp:posOffset>
@@ -5947,7 +5947,7 @@
           <w:noProof/>
         </w:rPr>
         <w:drawing>
-          <wp:anchor distT="0" distB="0" distL="114300" distR="114300" simplePos="0" relativeHeight="251658241" behindDoc="0" locked="0" layoutInCell="1" allowOverlap="1" wp14:anchorId="63B951CB" wp14:editId="0F92FB26">
+          <wp:anchor distT="0" distB="0" distL="114300" distR="114300" simplePos="0" relativeHeight="251658241" behindDoc="0" locked="0" layoutInCell="1" allowOverlap="1" wp14:anchorId="63B951CB" wp14:editId="1B27D4C2">
             <wp:simplePos x="0" y="0"/>
             <wp:positionH relativeFrom="column">
               <wp:posOffset>4541520</wp:posOffset>
@@ -6617,25 +6617,7 @@
           <w:szCs w:val="22"/>
           <w:lang w:eastAsia="fr-FR"/>
         </w:rPr>
-        <w:t xml:space="preserve"> d'un contrat. Les publications sont classées par popularité, </w:t>
-      </w:r>
-      <w:r>
-        <w:rPr>
-          <w:rFonts w:ascii="Century Gothic" w:hAnsi="Century Gothic"/>
-          <w:sz w:val="22"/>
-          <w:szCs w:val="22"/>
-          <w:lang w:eastAsia="fr-FR"/>
-        </w:rPr>
-        <w:t>de manière</w:t>
-      </w:r>
-      <w:r>
-        <w:rPr>
-          <w:rFonts w:ascii="Century Gothic" w:hAnsi="Century Gothic"/>
-          <w:sz w:val="22"/>
-          <w:szCs w:val="22"/>
-          <w:lang w:eastAsia="fr-FR"/>
-        </w:rPr>
-        <w:t xml:space="preserve"> que l'image ayant fait plus de contrats s'affiche en premier. Et, au choix de l'utilisateur, trois boutons</w:t>
+        <w:t xml:space="preserve"> d'un contrat. Les publications sont classées par popularité, de manière que l'image ayant fait plus de contrats s'affiche en premier. Et, au choix de l'utilisateur, trois boutons</w:t>
       </w:r>
       <w:r>
         <w:rPr>
@@ -10098,10 +10080,10 @@
           <w:noProof/>
         </w:rPr>
         <w:drawing>
-          <wp:inline distT="0" distB="0" distL="0" distR="0" wp14:anchorId="50D14549" wp14:editId="2D257677">
-            <wp:extent cx="5760720" cy="5897880"/>
-            <wp:effectExtent l="0" t="0" r="0" b="7620"/>
-            <wp:docPr id="1955728083" name="Image 2"/>
+          <wp:inline distT="0" distB="0" distL="0" distR="0" wp14:anchorId="30CF5481" wp14:editId="16A437EA">
+            <wp:extent cx="5760720" cy="5897245"/>
+            <wp:effectExtent l="0" t="0" r="0" b="8255"/>
+            <wp:docPr id="637001460" name="Image 3" descr="PlantUML Diagram"/>
             <wp:cNvGraphicFramePr>
               <a:graphicFrameLocks xmlns:a="http://schemas.openxmlformats.org/drawingml/2006/main" noChangeAspect="1"/>
             </wp:cNvGraphicFramePr>
@@ -10109,7 +10091,7 @@
               <a:graphicData uri="http://schemas.openxmlformats.org/drawingml/2006/picture">
                 <pic:pic xmlns:pic="http://schemas.openxmlformats.org/drawingml/2006/picture">
                   <pic:nvPicPr>
-                    <pic:cNvPr id="0" name="Picture 2"/>
+                    <pic:cNvPr id="0" name="Picture 5" descr="PlantUML Diagram"/>
                     <pic:cNvPicPr>
                       <a:picLocks noChangeAspect="1" noChangeArrowheads="1"/>
                     </pic:cNvPicPr>
@@ -10130,7 +10112,7 @@
                   <pic:spPr bwMode="auto">
                     <a:xfrm>
                       <a:off x="0" y="0"/>
-                      <a:ext cx="5760720" cy="5897880"/>
+                      <a:ext cx="5760720" cy="5897245"/>
                     </a:xfrm>
                     <a:prstGeom prst="rect">
                       <a:avLst/>
@@ -10180,22 +10162,13 @@
         <w:t xml:space="preserve">La logique de mon code est conçue pour être modulaire </w:t>
       </w:r>
       <w:r>
-        <w:t xml:space="preserve">MVVA </w:t>
+        <w:t xml:space="preserve">MVA </w:t>
       </w:r>
       <w:r>
         <w:t>et sécurisée</w:t>
       </w:r>
       <w:r>
-        <w:t>. L</w:t>
-      </w:r>
-      <w:r>
-        <w:t>’organisation du le code</w:t>
-      </w:r>
-      <w:r>
-        <w:t xml:space="preserve"> </w:t>
-      </w:r>
-      <w:r>
-        <w:t>est construit par la s</w:t>
+        <w:t>. L’organisation du le code est construit par la s</w:t>
       </w:r>
       <w:r>
         <w:t>éparation entre les services de données (</w:t>
@@ -10317,67 +10290,26 @@
           <w:iCs/>
           <w:lang w:val="en-US"/>
         </w:rPr>
-        <w:t>P_APPRO1_ProPhotoStock</w:t>
-      </w:r>
-      <w:r>
+        <w:t>P_APPRO1_ProPhotoStock/app</w:t>
+      </w:r>
+    </w:p>
+    <w:p>
+      <w:pPr>
         <w:rPr>
           <w:i/>
           <w:iCs/>
           <w:lang w:val="en-US"/>
         </w:rPr>
-        <w:t xml:space="preserve">/app et </w:t>
-      </w:r>
-      <w:r>
-        <w:rPr>
-          <w:i/>
-          <w:iCs/>
-          <w:lang w:val="en-US"/>
-        </w:rPr>
-        <w:t>P_APPRO1_ProPhotoStock/</w:t>
-      </w:r>
-      <w:proofErr w:type="gramStart"/>
-      <w:r>
-        <w:rPr>
-          <w:i/>
-          <w:iCs/>
-          <w:lang w:val="en-US"/>
-        </w:rPr>
-        <w:t>backend</w:t>
-      </w:r>
-      <w:r>
-        <w:rPr>
-          <w:i/>
-          <w:iCs/>
-          <w:lang w:val="en-US"/>
-        </w:rPr>
-        <w:t xml:space="preserve"> </w:t>
-      </w:r>
-      <w:r>
-        <w:rPr>
-          <w:i/>
-          <w:iCs/>
-          <w:lang w:val="en-US"/>
-        </w:rPr>
-        <w:t>:</w:t>
-      </w:r>
-      <w:proofErr w:type="gramEnd"/>
-    </w:p>
-    <w:p>
-      <w:pPr>
-        <w:rPr>
-          <w:i/>
-          <w:iCs/>
-        </w:rPr>
       </w:pPr>
       <w:r>
         <w:rPr>
           <w:noProof/>
         </w:rPr>
         <w:drawing>
-          <wp:inline distT="0" distB="0" distL="0" distR="0" wp14:anchorId="3A9301E6" wp14:editId="34BCB6C9">
-            <wp:extent cx="2609850" cy="6029325"/>
-            <wp:effectExtent l="0" t="0" r="0" b="9525"/>
-            <wp:docPr id="2036793687" name="Image 1"/>
+          <wp:inline distT="0" distB="0" distL="0" distR="0" wp14:anchorId="4C5D845C" wp14:editId="0D711B57">
+            <wp:extent cx="5760720" cy="6711950"/>
+            <wp:effectExtent l="0" t="0" r="0" b="0"/>
+            <wp:docPr id="922197044" name="Image 2" descr="PlantUML Diagram"/>
             <wp:cNvGraphicFramePr>
               <a:graphicFrameLocks xmlns:a="http://schemas.openxmlformats.org/drawingml/2006/main" noChangeAspect="1"/>
             </wp:cNvGraphicFramePr>
@@ -10385,23 +10317,36 @@
               <a:graphicData uri="http://schemas.openxmlformats.org/drawingml/2006/picture">
                 <pic:pic xmlns:pic="http://schemas.openxmlformats.org/drawingml/2006/picture">
                   <pic:nvPicPr>
-                    <pic:cNvPr id="2036793687" name=""/>
-                    <pic:cNvPicPr/>
+                    <pic:cNvPr id="0" name="Picture 3" descr="PlantUML Diagram"/>
+                    <pic:cNvPicPr>
+                      <a:picLocks noChangeAspect="1" noChangeArrowheads="1"/>
+                    </pic:cNvPicPr>
                   </pic:nvPicPr>
                   <pic:blipFill>
-                    <a:blip r:embed="rId37"/>
+                    <a:blip r:embed="rId37">
+                      <a:extLst>
+                        <a:ext uri="{28A0092B-C50C-407E-A947-70E740481C1C}">
+                          <a14:useLocalDpi xmlns:a14="http://schemas.microsoft.com/office/drawing/2010/main" val="0"/>
+                        </a:ext>
+                      </a:extLst>
+                    </a:blip>
+                    <a:srcRect/>
                     <a:stretch>
                       <a:fillRect/>
                     </a:stretch>
                   </pic:blipFill>
-                  <pic:spPr>
+                  <pic:spPr bwMode="auto">
                     <a:xfrm>
                       <a:off x="0" y="0"/>
-                      <a:ext cx="2609850" cy="6029325"/>
+                      <a:ext cx="5760720" cy="6711950"/>
                     </a:xfrm>
                     <a:prstGeom prst="rect">
                       <a:avLst/>
                     </a:prstGeom>
+                    <a:noFill/>
+                    <a:ln>
+                      <a:noFill/>
+                    </a:ln>
                   </pic:spPr>
                 </pic:pic>
               </a:graphicData>
@@ -10409,53 +10354,6 @@
           </wp:inline>
         </w:drawing>
       </w:r>
-      <w:r>
-        <w:rPr>
-          <w:i/>
-          <w:iCs/>
-        </w:rPr>
-        <w:t xml:space="preserve"> </w:t>
-      </w:r>
-      <w:r>
-        <w:rPr>
-          <w:noProof/>
-        </w:rPr>
-        <w:drawing>
-          <wp:inline distT="0" distB="0" distL="0" distR="0" wp14:anchorId="7059DEE2" wp14:editId="42C881FB">
-            <wp:extent cx="1790700" cy="5934075"/>
-            <wp:effectExtent l="0" t="0" r="0" b="9525"/>
-            <wp:docPr id="1608051916" name="Image 1"/>
-            <wp:cNvGraphicFramePr>
-              <a:graphicFrameLocks xmlns:a="http://schemas.openxmlformats.org/drawingml/2006/main" noChangeAspect="1"/>
-            </wp:cNvGraphicFramePr>
-            <a:graphic xmlns:a="http://schemas.openxmlformats.org/drawingml/2006/main">
-              <a:graphicData uri="http://schemas.openxmlformats.org/drawingml/2006/picture">
-                <pic:pic xmlns:pic="http://schemas.openxmlformats.org/drawingml/2006/picture">
-                  <pic:nvPicPr>
-                    <pic:cNvPr id="1608051916" name=""/>
-                    <pic:cNvPicPr/>
-                  </pic:nvPicPr>
-                  <pic:blipFill>
-                    <a:blip r:embed="rId38"/>
-                    <a:stretch>
-                      <a:fillRect/>
-                    </a:stretch>
-                  </pic:blipFill>
-                  <pic:spPr>
-                    <a:xfrm>
-                      <a:off x="0" y="0"/>
-                      <a:ext cx="1790700" cy="5934075"/>
-                    </a:xfrm>
-                    <a:prstGeom prst="rect">
-                      <a:avLst/>
-                    </a:prstGeom>
-                  </pic:spPr>
-                </pic:pic>
-              </a:graphicData>
-            </a:graphic>
-          </wp:inline>
-        </w:drawing>
-      </w:r>
     </w:p>
     <w:p>
       <w:pPr>
@@ -10467,34 +10365,92 @@
         <w:rPr>
           <w:i/>
           <w:iCs/>
+          <w:lang w:val="en-US"/>
         </w:rPr>
       </w:pPr>
       <w:r>
         <w:rPr>
           <w:i/>
           <w:iCs/>
-        </w:rPr>
-        <w:t>P_APPRO1_ProPhotoStock</w:t>
-      </w:r>
-      <w:r>
+          <w:lang w:val="en-US"/>
+        </w:rPr>
+        <w:t>P_APPRO1_ProPhotoStock/backend</w:t>
+      </w:r>
+    </w:p>
+    <w:p>
+      <w:pPr>
         <w:rPr>
           <w:i/>
           <w:iCs/>
-        </w:rPr>
-        <w:t>/doc :</w:t>
-      </w:r>
+          <w:lang w:val="en-US"/>
+        </w:rPr>
+      </w:pPr>
     </w:p>
     <w:p>
       <w:pPr>
         <w:rPr>
           <w:i/>
           <w:iCs/>
+          <w:lang w:val="en-US"/>
+        </w:rPr>
+      </w:pPr>
+    </w:p>
+    <w:p>
+      <w:pPr>
+        <w:rPr>
+          <w:i/>
+          <w:iCs/>
+          <w:lang w:val="en-US"/>
+        </w:rPr>
+      </w:pPr>
+      <w:r>
+        <w:rPr>
+          <w:i/>
+          <w:iCs/>
+          <w:lang w:val="en-US"/>
+        </w:rPr>
+        <w:t xml:space="preserve"> </w:t>
+      </w:r>
+    </w:p>
+    <w:p>
+      <w:pPr>
+        <w:pStyle w:val="Paragraphedeliste"/>
+        <w:numPr>
+          <w:ilvl w:val="1"/>
+          <w:numId w:val="38"/>
+        </w:numPr>
+        <w:rPr>
+          <w:i/>
+          <w:iCs/>
+        </w:rPr>
+      </w:pPr>
+      <w:r>
+        <w:rPr>
+          <w:i/>
+          <w:iCs/>
+        </w:rPr>
+        <w:t>P_APPRO1_ProPhotoStock</w:t>
+      </w:r>
+      <w:r>
+        <w:rPr>
+          <w:i/>
+          <w:iCs/>
+        </w:rPr>
+        <w:t>/doc :</w:t>
+      </w:r>
+    </w:p>
+    <w:p>
+      <w:pPr>
+        <w:rPr>
+          <w:i/>
+          <w:iCs/>
         </w:rPr>
       </w:pPr>
       <w:r>
         <w:rPr>
           <w:noProof/>
         </w:rPr>
+        <w:lastRenderedPageBreak/>
         <w:drawing>
           <wp:inline distT="0" distB="0" distL="0" distR="0" wp14:anchorId="750AF1DE" wp14:editId="3FEDB800">
             <wp:extent cx="1381125" cy="1019175"/>
@@ -10511,7 +10467,7 @@
                     <pic:cNvPicPr/>
                   </pic:nvPicPr>
                   <pic:blipFill>
-                    <a:blip r:embed="rId39"/>
+                    <a:blip r:embed="rId38"/>
                     <a:stretch>
                       <a:fillRect/>
                     </a:stretch>
@@ -10565,7 +10521,6 @@
           <w:noProof/>
           <w:lang w:eastAsia="fr-CH"/>
         </w:rPr>
-        <w:lastRenderedPageBreak/>
         <w:drawing>
           <wp:inline distT="0" distB="0" distL="0" distR="0" wp14:anchorId="1B3DBD5A" wp14:editId="2A95F951">
             <wp:extent cx="4486910" cy="2328545"/>
@@ -10584,7 +10539,7 @@
                     </pic:cNvPicPr>
                   </pic:nvPicPr>
                   <pic:blipFill>
-                    <a:blip r:embed="rId40">
+                    <a:blip r:embed="rId39">
                       <a:extLst>
                         <a:ext uri="{28A0092B-C50C-407E-A947-70E740481C1C}">
                           <a14:useLocalDpi xmlns:a14="http://schemas.microsoft.com/office/drawing/2010/main" val="0"/>
@@ -10662,7 +10617,7 @@
                     <pic:cNvPicPr/>
                   </pic:nvPicPr>
                   <pic:blipFill>
-                    <a:blip r:embed="rId41"/>
+                    <a:blip r:embed="rId40"/>
                     <a:stretch>
                       <a:fillRect/>
                     </a:stretch>
@@ -10740,9 +10695,9 @@
         </w:rPr>
         <w:lastRenderedPageBreak/>
         <w:drawing>
-          <wp:inline distT="0" distB="0" distL="0" distR="0" wp14:anchorId="07F2FC00" wp14:editId="748280E5">
-            <wp:extent cx="3137126" cy="5794744"/>
-            <wp:effectExtent l="0" t="0" r="6350" b="0"/>
+          <wp:inline distT="0" distB="0" distL="0" distR="0" wp14:anchorId="07F2FC00" wp14:editId="4600CAFF">
+            <wp:extent cx="2320506" cy="6064883"/>
+            <wp:effectExtent l="0" t="0" r="3810" b="0"/>
             <wp:docPr id="999513633" name="Image 10"/>
             <wp:cNvGraphicFramePr>
               <a:graphicFrameLocks xmlns:a="http://schemas.openxmlformats.org/drawingml/2006/main" noChangeAspect="1"/>
@@ -10757,20 +10712,20 @@
                     </pic:cNvPicPr>
                   </pic:nvPicPr>
                   <pic:blipFill rotWithShape="1">
-                    <a:blip r:embed="rId42">
+                    <a:blip r:embed="rId41">
                       <a:extLst>
                         <a:ext uri="{28A0092B-C50C-407E-A947-70E740481C1C}">
                           <a14:useLocalDpi xmlns:a14="http://schemas.microsoft.com/office/drawing/2010/main" val="0"/>
                         </a:ext>
                       </a:extLst>
                     </a:blip>
-                    <a:srcRect r="56811"/>
+                    <a:srcRect l="1425" t="149" r="68052" b="-149"/>
                     <a:stretch/>
                   </pic:blipFill>
                   <pic:spPr bwMode="auto">
                     <a:xfrm>
                       <a:off x="0" y="0"/>
-                      <a:ext cx="3154385" cy="5826624"/>
+                      <a:ext cx="2335324" cy="6103611"/>
                     </a:xfrm>
                     <a:prstGeom prst="rect">
                       <a:avLst/>
@@ -11148,6 +11103,7 @@
         <w:rPr>
           <w:i/>
         </w:rPr>
+        <w:lastRenderedPageBreak/>
         <w:t>Description détaillée</w:t>
       </w:r>
     </w:p>
@@ -11166,7 +11122,6 @@
         <w:rPr>
           <w:i/>
         </w:rPr>
-        <w:lastRenderedPageBreak/>
         <w:t>Conséquences sur l'utilisation du produit</w:t>
       </w:r>
       <w:bookmarkEnd w:id="41"/>
@@ -11390,7 +11345,7 @@
     </w:p>
     <w:p>
       <w:pPr>
-        <w:ind w:left="-851"/>
+        <w:jc w:val="center"/>
         <w:rPr>
           <w:szCs w:val="14"/>
         </w:rPr>
@@ -11400,9 +11355,9 @@
           <w:noProof/>
         </w:rPr>
         <w:drawing>
-          <wp:inline distT="0" distB="0" distL="0" distR="0" wp14:anchorId="3B678F45" wp14:editId="6B0E0D19">
-            <wp:extent cx="6921795" cy="2333207"/>
-            <wp:effectExtent l="0" t="0" r="0" b="0"/>
+          <wp:inline distT="0" distB="0" distL="0" distR="0" wp14:anchorId="3B678F45" wp14:editId="632D09C3">
+            <wp:extent cx="5132040" cy="3234906"/>
+            <wp:effectExtent l="0" t="0" r="0" b="3810"/>
             <wp:docPr id="1329124887" name="Image 1"/>
             <wp:cNvGraphicFramePr>
               <a:graphicFrameLocks xmlns:a="http://schemas.openxmlformats.org/drawingml/2006/main" noChangeAspect="1"/>
@@ -11414,20 +11369,83 @@
                     <pic:cNvPr id="1329124887" name=""/>
                     <pic:cNvPicPr/>
                   </pic:nvPicPr>
-                  <pic:blipFill>
-                    <a:blip r:embed="rId43"/>
-                    <a:stretch>
-                      <a:fillRect/>
-                    </a:stretch>
+                  <pic:blipFill rotWithShape="1">
+                    <a:blip r:embed="rId42"/>
+                    <a:srcRect l="1583" t="11361" r="53538" b="4716"/>
+                    <a:stretch/>
                   </pic:blipFill>
-                  <pic:spPr>
+                  <pic:spPr bwMode="auto">
                     <a:xfrm>
                       <a:off x="0" y="0"/>
-                      <a:ext cx="6942249" cy="2340102"/>
+                      <a:ext cx="5167963" cy="3257549"/>
                     </a:xfrm>
                     <a:prstGeom prst="rect">
                       <a:avLst/>
                     </a:prstGeom>
+                    <a:ln>
+                      <a:noFill/>
+                    </a:ln>
+                    <a:extLst>
+                      <a:ext uri="{53640926-AAD7-44D8-BBD7-CCE9431645EC}">
+                        <a14:shadowObscured xmlns:a14="http://schemas.microsoft.com/office/drawing/2010/main"/>
+                      </a:ext>
+                    </a:extLst>
+                  </pic:spPr>
+                </pic:pic>
+              </a:graphicData>
+            </a:graphic>
+          </wp:inline>
+        </w:drawing>
+      </w:r>
+    </w:p>
+    <w:p>
+      <w:pPr>
+        <w:ind w:left="-851"/>
+        <w:rPr>
+          <w:szCs w:val="14"/>
+        </w:rPr>
+      </w:pPr>
+      <w:r>
+        <w:rPr>
+          <w:noProof/>
+        </w:rPr>
+        <w:lastRenderedPageBreak/>
+        <w:drawing>
+          <wp:inline distT="0" distB="0" distL="0" distR="0" wp14:anchorId="0F55D41E" wp14:editId="0AAA2019">
+            <wp:extent cx="5323973" cy="3136605"/>
+            <wp:effectExtent l="0" t="0" r="0" b="6985"/>
+            <wp:docPr id="1699468174" name="Image 1"/>
+            <wp:cNvGraphicFramePr>
+              <a:graphicFrameLocks xmlns:a="http://schemas.openxmlformats.org/drawingml/2006/main" noChangeAspect="1"/>
+            </wp:cNvGraphicFramePr>
+            <a:graphic xmlns:a="http://schemas.openxmlformats.org/drawingml/2006/main">
+              <a:graphicData uri="http://schemas.openxmlformats.org/drawingml/2006/picture">
+                <pic:pic xmlns:pic="http://schemas.openxmlformats.org/drawingml/2006/picture">
+                  <pic:nvPicPr>
+                    <pic:cNvPr id="1329124887" name=""/>
+                    <pic:cNvPicPr/>
+                  </pic:nvPicPr>
+                  <pic:blipFill rotWithShape="1">
+                    <a:blip r:embed="rId42"/>
+                    <a:srcRect l="49848" t="11502" r="2513" b="5231"/>
+                    <a:stretch/>
+                  </pic:blipFill>
+                  <pic:spPr bwMode="auto">
+                    <a:xfrm>
+                      <a:off x="0" y="0"/>
+                      <a:ext cx="5331451" cy="3141010"/>
+                    </a:xfrm>
+                    <a:prstGeom prst="rect">
+                      <a:avLst/>
+                    </a:prstGeom>
+                    <a:ln>
+                      <a:noFill/>
+                    </a:ln>
+                    <a:extLst>
+                      <a:ext uri="{53640926-AAD7-44D8-BBD7-CCE9431645EC}">
+                        <a14:shadowObscured xmlns:a14="http://schemas.microsoft.com/office/drawing/2010/main"/>
+                      </a:ext>
+                    </a:extLst>
                   </pic:spPr>
                 </pic:pic>
               </a:graphicData>
@@ -12420,12 +12438,104 @@
         </w:rPr>
         <w:t>résultat</w:t>
       </w:r>
+      <w:r>
+        <w:rPr>
+          <w:lang w:eastAsia="fr-CH"/>
+        </w:rPr>
+        <w:br/>
+      </w:r>
+      <w:r>
+        <w:rPr>
+          <w:lang w:eastAsia="fr-CH"/>
+        </w:rPr>
+        <w:br/>
+      </w:r>
+      <w:r>
+        <w:rPr>
+          <w:noProof/>
+        </w:rPr>
+        <w:drawing>
+          <wp:inline distT="0" distB="0" distL="0" distR="0" wp14:anchorId="17DC9463" wp14:editId="0435613A">
+            <wp:extent cx="2609850" cy="6029325"/>
+            <wp:effectExtent l="0" t="0" r="0" b="9525"/>
+            <wp:docPr id="1840497602" name="Image 1"/>
+            <wp:cNvGraphicFramePr>
+              <a:graphicFrameLocks xmlns:a="http://schemas.openxmlformats.org/drawingml/2006/main" noChangeAspect="1"/>
+            </wp:cNvGraphicFramePr>
+            <a:graphic xmlns:a="http://schemas.openxmlformats.org/drawingml/2006/main">
+              <a:graphicData uri="http://schemas.openxmlformats.org/drawingml/2006/picture">
+                <pic:pic xmlns:pic="http://schemas.openxmlformats.org/drawingml/2006/picture">
+                  <pic:nvPicPr>
+                    <pic:cNvPr id="2036793687" name=""/>
+                    <pic:cNvPicPr/>
+                  </pic:nvPicPr>
+                  <pic:blipFill>
+                    <a:blip r:embed="rId43"/>
+                    <a:stretch>
+                      <a:fillRect/>
+                    </a:stretch>
+                  </pic:blipFill>
+                  <pic:spPr>
+                    <a:xfrm>
+                      <a:off x="0" y="0"/>
+                      <a:ext cx="2609850" cy="6029325"/>
+                    </a:xfrm>
+                    <a:prstGeom prst="rect">
+                      <a:avLst/>
+                    </a:prstGeom>
+                  </pic:spPr>
+                </pic:pic>
+              </a:graphicData>
+            </a:graphic>
+          </wp:inline>
+        </w:drawing>
+      </w:r>
+      <w:r>
+        <w:rPr>
+          <w:noProof/>
+        </w:rPr>
+        <w:drawing>
+          <wp:inline distT="0" distB="0" distL="0" distR="0" wp14:anchorId="246C4903" wp14:editId="6939B814">
+            <wp:extent cx="1790700" cy="5934075"/>
+            <wp:effectExtent l="0" t="0" r="0" b="9525"/>
+            <wp:docPr id="1659940431" name="Image 1"/>
+            <wp:cNvGraphicFramePr>
+              <a:graphicFrameLocks xmlns:a="http://schemas.openxmlformats.org/drawingml/2006/main" noChangeAspect="1"/>
+            </wp:cNvGraphicFramePr>
+            <a:graphic xmlns:a="http://schemas.openxmlformats.org/drawingml/2006/main">
+              <a:graphicData uri="http://schemas.openxmlformats.org/drawingml/2006/picture">
+                <pic:pic xmlns:pic="http://schemas.openxmlformats.org/drawingml/2006/picture">
+                  <pic:nvPicPr>
+                    <pic:cNvPr id="1608051916" name=""/>
+                    <pic:cNvPicPr/>
+                  </pic:nvPicPr>
+                  <pic:blipFill>
+                    <a:blip r:embed="rId44"/>
+                    <a:stretch>
+                      <a:fillRect/>
+                    </a:stretch>
+                  </pic:blipFill>
+                  <pic:spPr>
+                    <a:xfrm>
+                      <a:off x="0" y="0"/>
+                      <a:ext cx="1790700" cy="5934075"/>
+                    </a:xfrm>
+                    <a:prstGeom prst="rect">
+                      <a:avLst/>
+                    </a:prstGeom>
+                  </pic:spPr>
+                </pic:pic>
+              </a:graphicData>
+            </a:graphic>
+          </wp:inline>
+        </w:drawing>
+      </w:r>
     </w:p>
     <w:sectPr>
-      <w:headerReference w:type="default" r:id="rId44"/>
-      <w:footerReference w:type="default" r:id="rId45"/>
-      <w:headerReference w:type="first" r:id="rId46"/>
-      <w:footerReference w:type="first" r:id="rId47"/>
+      <w:headerReference w:type="default" r:id="rId45"/>
+      <w:footerReference w:type="default" r:id="rId46"/>
+      <w:headerReference w:type="first" r:id="rId47"/>
+      <w:footerReference w:type="first" r:id="rId48"/>
       <w:pgSz w:w="11906" w:h="16838"/>
       <w:pgMar w:top="1417" w:right="1417" w:bottom="1417" w:left="1417" w:header="708" w:footer="708" w:gutter="0"/>
       <w:cols w:space="708"/>
@@ -12529,7 +12639,7 @@
             </wp:anchor>
           </w:drawing>
         </mc:Choice>
-        <mc:Fallback xmlns:w16du="http://schemas.microsoft.com/office/word/2023/wordml/word16du" xmlns:w16sdtfl="http://schemas.microsoft.com/office/word/2024/wordml/sdtformatlock" xmlns:a="http://schemas.openxmlformats.org/drawingml/2006/main" xmlns:arto="http://schemas.microsoft.com/office/word/2006/arto">
+        <mc:Fallback xmlns:arto="http://schemas.microsoft.com/office/word/2006/arto" xmlns:a="http://schemas.openxmlformats.org/drawingml/2006/main" xmlns:w16sdtfl="http://schemas.microsoft.com/office/word/2024/wordml/sdtformatlock" xmlns:w16du="http://schemas.microsoft.com/office/word/2023/wordml/word16du">
           <w:pict w14:anchorId="2AC6186A">
             <v:line id="Conector recto 2" style="position:absolute;z-index:251659264;visibility:visible;mso-wrap-style:square;mso-width-percent:0;mso-wrap-distance-left:9pt;mso-wrap-distance-top:0;mso-wrap-distance-right:9pt;mso-wrap-distance-bottom:0;mso-position-horizontal:left;mso-position-horizontal-relative:margin;mso-position-vertical:absolute;mso-position-vertical-relative:text;mso-width-percent:0;mso-width-relative:margin" o:spid="_x0000_s1026" strokecolor="#4472c4 [3204]" strokeweight=".5pt" from="0,20.1pt" to="452.9pt,20.1pt" w14:anchorId="378E8825" o:gfxdata="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">
               <v:stroke joinstyle="miter"/>
@@ -18520,6 +18630,7 @@
   <w:style w:type="character" w:default="1" w:styleId="Policepardfaut">
     <w:name w:val="Default Paragraph Font"/>
     <w:uiPriority w:val="1"/>
+    <w:semiHidden/>
     <w:unhideWhenUsed/>
   </w:style>
   <w:style w:type="table" w:default="1" w:styleId="TableauNormal">
@@ -21563,6 +21674,7 @@
     <w:rsid w:val="00590BCE"/>
     <w:rsid w:val="005D0FBE"/>
     <w:rsid w:val="006108C4"/>
+    <w:rsid w:val="00662E4E"/>
     <w:rsid w:val="0067766A"/>
     <w:rsid w:val="006C65B6"/>
     <w:rsid w:val="006C65DA"/>
@@ -21585,6 +21697,7 @@
     <w:rsid w:val="00E124E3"/>
     <w:rsid w:val="00E72BAA"/>
     <w:rsid w:val="00EB6A2D"/>
+    <w:rsid w:val="00ED7028"/>
     <w:rsid w:val="00F775C9"/>
   </w:rsids>
   <m:mathPr>
@@ -22572,7 +22685,14 @@
 </file>
 
 <file path=customXml/item3.xml><?xml version="1.0" encoding="utf-8"?>
-<b:Sources xmlns:b="http://schemas.openxmlformats.org/officeDocument/2006/bibliography" xmlns="http://schemas.openxmlformats.org/officeDocument/2006/bibliography" SelectedStyle="\APASixthEditionOfficeOnline.xsl" StyleName="APA" Version="6"/>
+<p:properties xmlns:p="http://schemas.microsoft.com/office/2006/metadata/properties" xmlns:xsi="http://www.w3.org/2001/XMLSchema-instance" xmlns:pc="http://schemas.microsoft.com/office/infopath/2007/PartnerControls">
+  <documentManagement>
+    <TaxCatchAll xmlns="dfa80de1-e9bb-4cf2-893d-d06220b3971a" xsi:nil="true"/>
+    <lcf76f155ced4ddcb4097134ff3c332f xmlns="98d92101-24da-4498-9971-a24673344bd8">
+      <Terms xmlns="http://schemas.microsoft.com/office/infopath/2007/PartnerControls"/>
+    </lcf76f155ced4ddcb4097134ff3c332f>
+  </documentManagement>
+</p:properties>
 </file>
 
 <file path=customXml/item4.xml><?xml version="1.0" encoding="utf-8"?>
@@ -22585,14 +22705,7 @@
 </file>
 
 <file path=customXml/item5.xml><?xml version="1.0" encoding="utf-8"?>
-<p:properties xmlns:p="http://schemas.microsoft.com/office/2006/metadata/properties" xmlns:xsi="http://www.w3.org/2001/XMLSchema-instance" xmlns:pc="http://schemas.microsoft.com/office/infopath/2007/PartnerControls">
-  <documentManagement>
-    <TaxCatchAll xmlns="dfa80de1-e9bb-4cf2-893d-d06220b3971a" xsi:nil="true"/>
-    <lcf76f155ced4ddcb4097134ff3c332f xmlns="98d92101-24da-4498-9971-a24673344bd8">
-      <Terms xmlns="http://schemas.microsoft.com/office/infopath/2007/PartnerControls"/>
-    </lcf76f155ced4ddcb4097134ff3c332f>
-  </documentManagement>
-</p:properties>
+<b:Sources xmlns:b="http://schemas.openxmlformats.org/officeDocument/2006/bibliography" xmlns="http://schemas.openxmlformats.org/officeDocument/2006/bibliography" SelectedStyle="\APASixthEditionOfficeOnline.xsl" StyleName="APA" Version="6"/>
 </file>
 
 <file path=customXml/itemProps1.xml><?xml version="1.0" encoding="utf-8"?>
@@ -22623,9 +22736,12 @@
 </file>
 
 <file path=customXml/itemProps3.xml><?xml version="1.0" encoding="utf-8"?>
-<ds:datastoreItem xmlns:ds="http://schemas.openxmlformats.org/officeDocument/2006/customXml" ds:itemID="{FE924DA7-0126-48C5-870A-49921258AF89}">
+<ds:datastoreItem xmlns:ds="http://schemas.openxmlformats.org/officeDocument/2006/customXml" ds:itemID="{C94D97F5-7F04-4398-BD4F-61F68830E426}">
   <ds:schemaRefs>
-    <ds:schemaRef ds:uri="http://schemas.openxmlformats.org/officeDocument/2006/bibliography"/>
+    <ds:schemaRef ds:uri="http://schemas.microsoft.com/office/2006/metadata/properties"/>
+    <ds:schemaRef ds:uri="http://schemas.microsoft.com/office/infopath/2007/PartnerControls"/>
+    <ds:schemaRef ds:uri="dfa80de1-e9bb-4cf2-893d-d06220b3971a"/>
+    <ds:schemaRef ds:uri="98d92101-24da-4498-9971-a24673344bd8"/>
   </ds:schemaRefs>
 </ds:datastoreItem>
 </file>
@@ -22639,12 +22755,9 @@
 </file>
 
 <file path=customXml/itemProps5.xml><?xml version="1.0" encoding="utf-8"?>
-<ds:datastoreItem xmlns:ds="http://schemas.openxmlformats.org/officeDocument/2006/customXml" ds:itemID="{C94D97F5-7F04-4398-BD4F-61F68830E426}">
+<ds:datastoreItem xmlns:ds="http://schemas.openxmlformats.org/officeDocument/2006/customXml" ds:itemID="{FE924DA7-0126-48C5-870A-49921258AF89}">
   <ds:schemaRefs>
-    <ds:schemaRef ds:uri="http://schemas.microsoft.com/office/2006/metadata/properties"/>
-    <ds:schemaRef ds:uri="http://schemas.microsoft.com/office/infopath/2007/PartnerControls"/>
-    <ds:schemaRef ds:uri="dfa80de1-e9bb-4cf2-893d-d06220b3971a"/>
-    <ds:schemaRef ds:uri="98d92101-24da-4498-9971-a24673344bd8"/>
+    <ds:schemaRef ds:uri="http://schemas.openxmlformats.org/officeDocument/2006/bibliography"/>
   </ds:schemaRefs>
 </ds:datastoreItem>
 </file>
</xml_diff>